<commit_message>
Update Stats- HDip DBA Sept-26_2026617_CA-1.docx
</commit_message>
<xml_diff>
--- a/Stats- HDip DBA Sept-26_2026617_CA-1.docx
+++ b/Stats- HDip DBA Sept-26_2026617_CA-1.docx
@@ -1278,22 +1278,17 @@
       <w:sdtContent>
         <w:p>
           <w:pPr>
-            <w:pBdr>
-              <w:top w:val="nil"/>
-              <w:left w:val="nil"/>
-              <w:bottom w:val="nil"/>
-              <w:right w:val="nil"/>
-              <w:between w:val="nil"/>
-            </w:pBdr>
+            <w:pStyle w:val="TOC1"/>
             <w:tabs>
               <w:tab w:val="right" w:leader="dot" w:pos="9016"/>
             </w:tabs>
-            <w:spacing w:after="100"/>
             <w:rPr>
-              <w:rFonts w:ascii="Aptos" w:eastAsia="Aptos" w:hAnsi="Aptos" w:cs="Aptos"/>
-              <w:color w:val="000000"/>
+              <w:rFonts w:asciiTheme="minorHAnsi" w:eastAsiaTheme="minorEastAsia" w:hAnsiTheme="minorHAnsi" w:cstheme="minorBidi"/>
+              <w:noProof/>
+              <w:kern w:val="2"/>
               <w:sz w:val="24"/>
               <w:szCs w:val="24"/>
+              <w14:ligatures w14:val="standardContextual"/>
             </w:rPr>
           </w:pPr>
           <w:r>
@@ -1305,165 +1300,134 @@
           <w:r>
             <w:fldChar w:fldCharType="separate"/>
           </w:r>
-          <w:hyperlink w:anchor="_heading=h.gjdgxs">
+          <w:hyperlink w:anchor="_Toc244029381" w:history="1">
             <w:r>
               <w:rPr>
-                <w:color w:val="000000"/>
+                <w:rStyle w:val="Hyperlink"/>
+                <w:noProof/>
               </w:rPr>
-              <w:t>Introduction</w:t>
+              <w:t>References</w:t>
             </w:r>
             <w:r>
               <w:rPr>
-                <w:color w:val="000000"/>
+                <w:noProof/>
+                <w:webHidden/>
               </w:rPr>
               <w:tab/>
-              <w:t>1</w:t>
+            </w:r>
+            <w:r>
+              <w:rPr>
+                <w:noProof/>
+                <w:webHidden/>
+              </w:rPr>
+              <w:fldChar w:fldCharType="begin"/>
+            </w:r>
+            <w:r>
+              <w:rPr>
+                <w:noProof/>
+                <w:webHidden/>
+              </w:rPr>
+              <w:instrText xml:space="preserve"> PAGEREF _Toc244029381 \h </w:instrText>
+            </w:r>
+            <w:r>
+              <w:rPr>
+                <w:noProof/>
+                <w:webHidden/>
+              </w:rPr>
+            </w:r>
+            <w:r>
+              <w:rPr>
+                <w:noProof/>
+                <w:webHidden/>
+              </w:rPr>
+              <w:fldChar w:fldCharType="separate"/>
+            </w:r>
+            <w:r>
+              <w:rPr>
+                <w:noProof/>
+                <w:webHidden/>
+              </w:rPr>
+              <w:t>7</w:t>
+            </w:r>
+            <w:r>
+              <w:rPr>
+                <w:noProof/>
+                <w:webHidden/>
+              </w:rPr>
+              <w:fldChar w:fldCharType="end"/>
             </w:r>
           </w:hyperlink>
         </w:p>
         <w:p>
           <w:pPr>
-            <w:pBdr>
-              <w:top w:val="nil"/>
-              <w:left w:val="nil"/>
-              <w:bottom w:val="nil"/>
-              <w:right w:val="nil"/>
-              <w:between w:val="nil"/>
-            </w:pBdr>
+            <w:pStyle w:val="TOC1"/>
             <w:tabs>
               <w:tab w:val="right" w:leader="dot" w:pos="9016"/>
             </w:tabs>
-            <w:spacing w:after="100"/>
             <w:rPr>
-              <w:rFonts w:ascii="Aptos" w:eastAsia="Aptos" w:hAnsi="Aptos" w:cs="Aptos"/>
-              <w:color w:val="000000"/>
+              <w:rFonts w:asciiTheme="minorHAnsi" w:eastAsiaTheme="minorEastAsia" w:hAnsiTheme="minorHAnsi" w:cstheme="minorBidi"/>
+              <w:noProof/>
+              <w:kern w:val="2"/>
               <w:sz w:val="24"/>
               <w:szCs w:val="24"/>
+              <w14:ligatures w14:val="standardContextual"/>
             </w:rPr>
           </w:pPr>
-          <w:hyperlink w:anchor="_heading=h.30j0zll">
+          <w:hyperlink w:anchor="_Toc244029382" w:history="1">
             <w:r>
               <w:rPr>
-                <w:color w:val="000000"/>
+                <w:rStyle w:val="Hyperlink"/>
+                <w:noProof/>
               </w:rPr>
-              <w:t>Chapter 1</w:t>
+              <w:t>Appendix</w:t>
             </w:r>
             <w:r>
               <w:rPr>
-                <w:color w:val="000000"/>
+                <w:noProof/>
+                <w:webHidden/>
               </w:rPr>
               <w:tab/>
-              <w:t>1</w:t>
-            </w:r>
-          </w:hyperlink>
-        </w:p>
-        <w:p>
-          <w:pPr>
-            <w:pBdr>
-              <w:top w:val="nil"/>
-              <w:left w:val="nil"/>
-              <w:bottom w:val="nil"/>
-              <w:right w:val="nil"/>
-              <w:between w:val="nil"/>
-            </w:pBdr>
-            <w:tabs>
-              <w:tab w:val="right" w:leader="dot" w:pos="9016"/>
-            </w:tabs>
-            <w:spacing w:after="100"/>
-            <w:ind w:left="220"/>
-            <w:rPr>
-              <w:rFonts w:ascii="Aptos" w:eastAsia="Aptos" w:hAnsi="Aptos" w:cs="Aptos"/>
-              <w:color w:val="000000"/>
-              <w:sz w:val="24"/>
-              <w:szCs w:val="24"/>
-            </w:rPr>
-          </w:pPr>
-          <w:hyperlink w:anchor="_heading=h.1fob9te">
-            <w:r>
-              <w:rPr>
-                <w:color w:val="000000"/>
-              </w:rPr>
-              <w:t>Chapter 1.1</w:t>
             </w:r>
             <w:r>
               <w:rPr>
-                <w:color w:val="000000"/>
+                <w:noProof/>
+                <w:webHidden/>
               </w:rPr>
-              <w:tab/>
-              <w:t>1</w:t>
-            </w:r>
-          </w:hyperlink>
-        </w:p>
-        <w:p>
-          <w:pPr>
-            <w:pBdr>
-              <w:top w:val="nil"/>
-              <w:left w:val="nil"/>
-              <w:bottom w:val="nil"/>
-              <w:right w:val="nil"/>
-              <w:between w:val="nil"/>
-            </w:pBdr>
-            <w:tabs>
-              <w:tab w:val="right" w:leader="dot" w:pos="9016"/>
-            </w:tabs>
-            <w:spacing w:after="100"/>
-            <w:ind w:left="440"/>
-            <w:rPr>
-              <w:rFonts w:ascii="Aptos" w:eastAsia="Aptos" w:hAnsi="Aptos" w:cs="Aptos"/>
-              <w:color w:val="000000"/>
-              <w:sz w:val="24"/>
-              <w:szCs w:val="24"/>
-            </w:rPr>
-          </w:pPr>
-          <w:hyperlink w:anchor="_heading=h.3znysh7">
-            <w:r>
-              <w:rPr>
-                <w:color w:val="000000"/>
-              </w:rPr>
-              <w:t>Chapter 1.1.1.</w:t>
+              <w:fldChar w:fldCharType="begin"/>
             </w:r>
             <w:r>
               <w:rPr>
-                <w:color w:val="000000"/>
+                <w:noProof/>
+                <w:webHidden/>
               </w:rPr>
-              <w:tab/>
-              <w:t>1</w:t>
-            </w:r>
-          </w:hyperlink>
-        </w:p>
-        <w:p>
-          <w:pPr>
-            <w:pBdr>
-              <w:top w:val="nil"/>
-              <w:left w:val="nil"/>
-              <w:bottom w:val="nil"/>
-              <w:right w:val="nil"/>
-              <w:between w:val="nil"/>
-            </w:pBdr>
-            <w:tabs>
-              <w:tab w:val="right" w:leader="dot" w:pos="9016"/>
-            </w:tabs>
-            <w:spacing w:after="100"/>
-            <w:rPr>
-              <w:rFonts w:ascii="Aptos" w:eastAsia="Aptos" w:hAnsi="Aptos" w:cs="Aptos"/>
-              <w:color w:val="000000"/>
-              <w:sz w:val="24"/>
-              <w:szCs w:val="24"/>
-            </w:rPr>
-          </w:pPr>
-          <w:hyperlink w:anchor="_heading=h.2et92p0">
-            <w:r>
-              <w:rPr>
-                <w:color w:val="000000"/>
-              </w:rPr>
-              <w:t>References</w:t>
+              <w:instrText xml:space="preserve"> PAGEREF _Toc244029382 \h </w:instrText>
             </w:r>
             <w:r>
               <w:rPr>
-                <w:color w:val="000000"/>
+                <w:noProof/>
+                <w:webHidden/>
               </w:rPr>
-              <w:tab/>
-              <w:t>2</w:t>
+            </w:r>
+            <w:r>
+              <w:rPr>
+                <w:noProof/>
+                <w:webHidden/>
+              </w:rPr>
+              <w:fldChar w:fldCharType="separate"/>
+            </w:r>
+            <w:r>
+              <w:rPr>
+                <w:noProof/>
+                <w:webHidden/>
+              </w:rPr>
+              <w:t>8</w:t>
+            </w:r>
+            <w:r>
+              <w:rPr>
+                <w:noProof/>
+                <w:webHidden/>
+              </w:rPr>
+              <w:fldChar w:fldCharType="end"/>
             </w:r>
           </w:hyperlink>
         </w:p>
@@ -1508,8 +1472,6 @@
           <w:kern w:val="28"/>
         </w:rPr>
       </w:pPr>
-      <w:bookmarkStart w:id="13" w:name="_heading=h.gjdgxs" w:colFirst="0" w:colLast="0"/>
-      <w:bookmarkEnd w:id="13"/>
       <w:r>
         <w:rPr>
           <w:rFonts w:eastAsiaTheme="majorEastAsia"/>
@@ -1519,7 +1481,7 @@
         </w:rPr>
         <w:lastRenderedPageBreak/>
         <w:pict w14:anchorId="685D21F2">
-          <v:rect id="_x0000_i1037" style="width:0;height:1.5pt" o:hralign="center" o:hrstd="t" o:hr="t" fillcolor="#a0a0a0" stroked="f"/>
+          <v:rect id="_x0000_i1025" style="width:0;height:1.5pt" o:hralign="center" o:hrstd="t" o:hr="t" fillcolor="#a0a0a0" stroked="f"/>
         </w:pict>
       </w:r>
     </w:p>
@@ -2790,254 +2752,23 @@
     </w:p>
     <w:p>
       <w:pPr>
-        <w:rPr>
-          <w:rFonts w:eastAsiaTheme="majorEastAsia"/>
-          <w:color w:val="3A3A3A" w:themeColor="background2" w:themeShade="40"/>
-          <w:spacing w:val="-10"/>
-          <w:kern w:val="28"/>
-        </w:rPr>
-      </w:pPr>
-      <w:r>
-        <w:rPr>
-          <w:rFonts w:eastAsiaTheme="majorEastAsia"/>
-          <w:color w:val="3A3A3A" w:themeColor="background2" w:themeShade="40"/>
-          <w:spacing w:val="-10"/>
-          <w:kern w:val="28"/>
-        </w:rPr>
-        <w:t>[</w:t>
-      </w:r>
-      <w:proofErr w:type="spellStart"/>
-      <w:r>
-        <w:rPr>
-          <w:rFonts w:eastAsiaTheme="majorEastAsia"/>
-          <w:color w:val="3A3A3A" w:themeColor="background2" w:themeShade="40"/>
-          <w:spacing w:val="-10"/>
-          <w:kern w:val="28"/>
-        </w:rPr>
-        <w:t>Descreva</w:t>
-      </w:r>
-      <w:proofErr w:type="spellEnd"/>
-      <w:r>
-        <w:rPr>
-          <w:rFonts w:eastAsiaTheme="majorEastAsia"/>
-          <w:color w:val="3A3A3A" w:themeColor="background2" w:themeShade="40"/>
-          <w:spacing w:val="-10"/>
-          <w:kern w:val="28"/>
-        </w:rPr>
-        <w:t xml:space="preserve"> as </w:t>
-      </w:r>
-      <w:proofErr w:type="spellStart"/>
-      <w:r>
-        <w:rPr>
-          <w:rFonts w:eastAsiaTheme="majorEastAsia"/>
-          <w:color w:val="3A3A3A" w:themeColor="background2" w:themeShade="40"/>
-          <w:spacing w:val="-10"/>
-          <w:kern w:val="28"/>
-        </w:rPr>
-        <w:t>verificações</w:t>
-      </w:r>
-      <w:proofErr w:type="spellEnd"/>
-      <w:r>
-        <w:rPr>
-          <w:rFonts w:eastAsiaTheme="majorEastAsia"/>
-          <w:color w:val="3A3A3A" w:themeColor="background2" w:themeShade="40"/>
-          <w:spacing w:val="-10"/>
-          <w:kern w:val="28"/>
-        </w:rPr>
-        <w:t xml:space="preserve"> e </w:t>
-      </w:r>
-      <w:proofErr w:type="spellStart"/>
-      <w:r>
-        <w:rPr>
-          <w:rFonts w:eastAsiaTheme="majorEastAsia"/>
-          <w:color w:val="3A3A3A" w:themeColor="background2" w:themeShade="40"/>
-          <w:spacing w:val="-10"/>
-          <w:kern w:val="28"/>
-        </w:rPr>
-        <w:t>transformações</w:t>
-      </w:r>
-      <w:proofErr w:type="spellEnd"/>
-      <w:r>
-        <w:rPr>
-          <w:rFonts w:eastAsiaTheme="majorEastAsia"/>
-          <w:color w:val="3A3A3A" w:themeColor="background2" w:themeShade="40"/>
-          <w:spacing w:val="-10"/>
-          <w:kern w:val="28"/>
-        </w:rPr>
-        <w:t xml:space="preserve"> </w:t>
-      </w:r>
-      <w:proofErr w:type="spellStart"/>
-      <w:r>
-        <w:rPr>
-          <w:rFonts w:eastAsiaTheme="majorEastAsia"/>
-          <w:color w:val="3A3A3A" w:themeColor="background2" w:themeShade="40"/>
-          <w:spacing w:val="-10"/>
-          <w:kern w:val="28"/>
-        </w:rPr>
-        <w:t>realizadas</w:t>
-      </w:r>
-      <w:proofErr w:type="spellEnd"/>
-      <w:r>
-        <w:rPr>
-          <w:rFonts w:eastAsiaTheme="majorEastAsia"/>
-          <w:color w:val="3A3A3A" w:themeColor="background2" w:themeShade="40"/>
-          <w:spacing w:val="-10"/>
-          <w:kern w:val="28"/>
-        </w:rPr>
-        <w:t xml:space="preserve"> no Python.]</w:t>
-      </w:r>
-    </w:p>
-    <w:p>
-      <w:pPr>
-        <w:rPr>
-          <w:rFonts w:eastAsiaTheme="majorEastAsia"/>
-          <w:color w:val="3A3A3A" w:themeColor="background2" w:themeShade="40"/>
-          <w:spacing w:val="-10"/>
-          <w:kern w:val="28"/>
-        </w:rPr>
-      </w:pPr>
-      <w:r>
-        <w:rPr>
-          <w:rFonts w:eastAsiaTheme="majorEastAsia"/>
-          <w:color w:val="3A3A3A" w:themeColor="background2" w:themeShade="40"/>
-          <w:spacing w:val="-10"/>
-          <w:kern w:val="28"/>
-        </w:rPr>
-        <w:t>Explain:</w:t>
-      </w:r>
-    </w:p>
-    <w:p>
-      <w:pPr>
-        <w:numPr>
-          <w:ilvl w:val="0"/>
-          <w:numId w:val="12"/>
-        </w:numPr>
-        <w:rPr>
-          <w:rFonts w:eastAsiaTheme="majorEastAsia"/>
-          <w:color w:val="3A3A3A" w:themeColor="background2" w:themeShade="40"/>
-          <w:spacing w:val="-10"/>
-          <w:kern w:val="28"/>
-        </w:rPr>
-      </w:pPr>
-      <w:r>
-        <w:rPr>
-          <w:rFonts w:eastAsiaTheme="majorEastAsia"/>
-          <w:color w:val="3A3A3A" w:themeColor="background2" w:themeShade="40"/>
-          <w:spacing w:val="-10"/>
-          <w:kern w:val="28"/>
-        </w:rPr>
-        <w:t>How the CSV file was imported.</w:t>
-      </w:r>
-    </w:p>
-    <w:p>
-      <w:pPr>
-        <w:numPr>
-          <w:ilvl w:val="0"/>
-          <w:numId w:val="12"/>
-        </w:numPr>
-        <w:rPr>
-          <w:rFonts w:eastAsiaTheme="majorEastAsia"/>
-          <w:color w:val="3A3A3A" w:themeColor="background2" w:themeShade="40"/>
-          <w:spacing w:val="-10"/>
-          <w:kern w:val="28"/>
-        </w:rPr>
-      </w:pPr>
-      <w:r>
-        <w:rPr>
-          <w:rFonts w:eastAsiaTheme="majorEastAsia"/>
-          <w:color w:val="3A3A3A" w:themeColor="background2" w:themeShade="40"/>
-          <w:spacing w:val="-10"/>
-          <w:kern w:val="28"/>
-        </w:rPr>
-        <w:t>Whether missing values were identified.</w:t>
-      </w:r>
-    </w:p>
-    <w:p>
-      <w:pPr>
-        <w:numPr>
-          <w:ilvl w:val="0"/>
-          <w:numId w:val="12"/>
-        </w:numPr>
-        <w:rPr>
-          <w:rFonts w:eastAsiaTheme="majorEastAsia"/>
-          <w:color w:val="3A3A3A" w:themeColor="background2" w:themeShade="40"/>
-          <w:spacing w:val="-10"/>
-          <w:kern w:val="28"/>
-        </w:rPr>
-      </w:pPr>
-      <w:r>
-        <w:rPr>
-          <w:rFonts w:eastAsiaTheme="majorEastAsia"/>
-          <w:color w:val="3A3A3A" w:themeColor="background2" w:themeShade="40"/>
-          <w:spacing w:val="-10"/>
-          <w:kern w:val="28"/>
-        </w:rPr>
-        <w:t>Whether duplicate records or unusual values were investigated.</w:t>
-      </w:r>
-    </w:p>
-    <w:p>
-      <w:pPr>
-        <w:numPr>
-          <w:ilvl w:val="0"/>
-          <w:numId w:val="12"/>
-        </w:numPr>
-        <w:rPr>
-          <w:rFonts w:eastAsiaTheme="majorEastAsia"/>
-          <w:color w:val="3A3A3A" w:themeColor="background2" w:themeShade="40"/>
-          <w:spacing w:val="-10"/>
-          <w:kern w:val="28"/>
-        </w:rPr>
-      </w:pPr>
-      <w:r>
-        <w:rPr>
-          <w:rFonts w:eastAsiaTheme="majorEastAsia"/>
-          <w:color w:val="3A3A3A" w:themeColor="background2" w:themeShade="40"/>
-          <w:spacing w:val="-10"/>
-          <w:kern w:val="28"/>
-        </w:rPr>
-        <w:t>How categorical and numerical variables were identified.</w:t>
-      </w:r>
-    </w:p>
-    <w:p>
-      <w:pPr>
-        <w:numPr>
-          <w:ilvl w:val="0"/>
-          <w:numId w:val="12"/>
-        </w:numPr>
-        <w:rPr>
-          <w:rFonts w:eastAsiaTheme="majorEastAsia"/>
-          <w:color w:val="3A3A3A" w:themeColor="background2" w:themeShade="40"/>
-          <w:spacing w:val="-10"/>
-          <w:kern w:val="28"/>
-        </w:rPr>
-      </w:pPr>
-      <w:r>
-        <w:rPr>
-          <w:rFonts w:eastAsiaTheme="majorEastAsia"/>
-          <w:color w:val="3A3A3A" w:themeColor="background2" w:themeShade="40"/>
-          <w:spacing w:val="-10"/>
-          <w:kern w:val="28"/>
-        </w:rPr>
-        <w:t>How the binary variable success was created from y, if you use it.</w:t>
-      </w:r>
-    </w:p>
-    <w:p>
-      <w:pPr>
-        <w:rPr>
-          <w:rFonts w:eastAsiaTheme="majorEastAsia"/>
-          <w:color w:val="3A3A3A" w:themeColor="background2" w:themeShade="40"/>
-          <w:spacing w:val="-10"/>
-          <w:kern w:val="28"/>
-        </w:rPr>
-      </w:pPr>
-      <w:r>
-        <w:rPr>
-          <w:rFonts w:eastAsiaTheme="majorEastAsia"/>
-          <w:color w:val="3A3A3A" w:themeColor="background2" w:themeShade="40"/>
-          <w:spacing w:val="-10"/>
-          <w:kern w:val="28"/>
-        </w:rPr>
-        <w:t xml:space="preserve">Include only procedures that you </w:t>
+        <w:ind w:firstLine="720"/>
+        <w:jc w:val="both"/>
+        <w:rPr>
+          <w:rFonts w:eastAsiaTheme="majorEastAsia"/>
+          <w:color w:val="3A3A3A" w:themeColor="background2" w:themeShade="40"/>
+          <w:spacing w:val="-10"/>
+          <w:kern w:val="28"/>
+        </w:rPr>
+      </w:pPr>
+      <w:r>
+        <w:rPr>
+          <w:rFonts w:eastAsiaTheme="majorEastAsia"/>
+          <w:color w:val="3A3A3A" w:themeColor="background2" w:themeShade="40"/>
+          <w:spacing w:val="-10"/>
+          <w:kern w:val="28"/>
+        </w:rPr>
+        <w:t xml:space="preserve">The dataset was imported into Python using the </w:t>
       </w:r>
       <w:proofErr w:type="gramStart"/>
       <w:r>
@@ -3047,7 +2778,7 @@
           <w:spacing w:val="-10"/>
           <w:kern w:val="28"/>
         </w:rPr>
-        <w:t>actually performed</w:t>
+        <w:t>pandas</w:t>
       </w:r>
       <w:proofErr w:type="gramEnd"/>
       <w:r>
@@ -3057,7 +2788,78 @@
           <w:spacing w:val="-10"/>
           <w:kern w:val="28"/>
         </w:rPr>
-        <w:t>. Explain any decisions to retain or exclude observations.</w:t>
+        <w:t xml:space="preserve"> library. The initial inspection confirmed 45,211 observations and 17 variables. The </w:t>
+      </w:r>
+      <w:proofErr w:type="gramStart"/>
+      <w:r>
+        <w:rPr>
+          <w:rFonts w:eastAsiaTheme="majorEastAsia"/>
+          <w:color w:val="3A3A3A" w:themeColor="background2" w:themeShade="40"/>
+          <w:spacing w:val="-10"/>
+          <w:kern w:val="28"/>
+        </w:rPr>
+        <w:t>info(</w:t>
+      </w:r>
+      <w:proofErr w:type="gramEnd"/>
+      <w:r>
+        <w:rPr>
+          <w:rFonts w:eastAsiaTheme="majorEastAsia"/>
+          <w:color w:val="3A3A3A" w:themeColor="background2" w:themeShade="40"/>
+          <w:spacing w:val="-10"/>
+          <w:kern w:val="28"/>
+        </w:rPr>
+        <w:t xml:space="preserve">) and </w:t>
+      </w:r>
+      <w:proofErr w:type="spellStart"/>
+      <w:proofErr w:type="gramStart"/>
+      <w:r>
+        <w:rPr>
+          <w:rFonts w:eastAsiaTheme="majorEastAsia"/>
+          <w:color w:val="3A3A3A" w:themeColor="background2" w:themeShade="40"/>
+          <w:spacing w:val="-10"/>
+          <w:kern w:val="28"/>
+        </w:rPr>
+        <w:t>isnull</w:t>
+      </w:r>
+      <w:proofErr w:type="spellEnd"/>
+      <w:r>
+        <w:rPr>
+          <w:rFonts w:eastAsiaTheme="majorEastAsia"/>
+          <w:color w:val="3A3A3A" w:themeColor="background2" w:themeShade="40"/>
+          <w:spacing w:val="-10"/>
+          <w:kern w:val="28"/>
+        </w:rPr>
+        <w:t>(</w:t>
+      </w:r>
+      <w:proofErr w:type="gramEnd"/>
+      <w:r>
+        <w:rPr>
+          <w:rFonts w:eastAsiaTheme="majorEastAsia"/>
+          <w:color w:val="3A3A3A" w:themeColor="background2" w:themeShade="40"/>
+          <w:spacing w:val="-10"/>
+          <w:kern w:val="28"/>
+        </w:rPr>
+        <w:t xml:space="preserve">) methods showed that no conventional missing values were detected. However, further investigation identified “unknown” categories in the job, education, contact and </w:t>
+      </w:r>
+      <w:proofErr w:type="spellStart"/>
+      <w:r>
+        <w:rPr>
+          <w:rFonts w:eastAsiaTheme="majorEastAsia"/>
+          <w:color w:val="3A3A3A" w:themeColor="background2" w:themeShade="40"/>
+          <w:spacing w:val="-10"/>
+          <w:kern w:val="28"/>
+        </w:rPr>
+        <w:t>poutcome</w:t>
+      </w:r>
+      <w:proofErr w:type="spellEnd"/>
+      <w:r>
+        <w:rPr>
+          <w:rFonts w:eastAsiaTheme="majorEastAsia"/>
+          <w:color w:val="3A3A3A" w:themeColor="background2" w:themeShade="40"/>
+          <w:spacing w:val="-10"/>
+          <w:kern w:val="28"/>
+        </w:rPr>
+        <w:t xml:space="preserve"> variables. These occurred 288, 1,857, 13,020 and 36,959 times, respectively. These categories were retained during the initial analysis rather than being automatically removed or replaced. Numerical variables were examined using descriptive statistics, including the mean, median, standard deviation, variance and skewness.</w:t>
       </w:r>
     </w:p>
     <w:p>
@@ -3118,450 +2920,14 @@
       <w:pPr>
         <w:rPr>
           <w:rFonts w:eastAsiaTheme="majorEastAsia"/>
-          <w:color w:val="3A3A3A" w:themeColor="background2" w:themeShade="40"/>
-          <w:spacing w:val="-10"/>
-          <w:kern w:val="28"/>
-          <w:lang w:val="it-IT"/>
-        </w:rPr>
-      </w:pPr>
-      <w:r>
-        <w:rPr>
-          <w:rFonts w:eastAsiaTheme="majorEastAsia"/>
-          <w:color w:val="3A3A3A" w:themeColor="background2" w:themeShade="40"/>
-          <w:spacing w:val="-10"/>
-          <w:kern w:val="28"/>
-          <w:lang w:val="it-IT"/>
-        </w:rPr>
-        <w:t>[</w:t>
-      </w:r>
-      <w:proofErr w:type="spellStart"/>
-      <w:r>
-        <w:rPr>
-          <w:rFonts w:eastAsiaTheme="majorEastAsia"/>
-          <w:color w:val="3A3A3A" w:themeColor="background2" w:themeShade="40"/>
-          <w:spacing w:val="-10"/>
-          <w:kern w:val="28"/>
-          <w:lang w:val="it-IT"/>
-        </w:rPr>
-        <w:t>Apresente</w:t>
-      </w:r>
-      <w:proofErr w:type="spellEnd"/>
-      <w:r>
-        <w:rPr>
-          <w:rFonts w:eastAsiaTheme="majorEastAsia"/>
-          <w:color w:val="3A3A3A" w:themeColor="background2" w:themeShade="40"/>
-          <w:spacing w:val="-10"/>
-          <w:kern w:val="28"/>
-          <w:lang w:val="it-IT"/>
-        </w:rPr>
-        <w:t xml:space="preserve"> e interprete </w:t>
-      </w:r>
-      <w:proofErr w:type="spellStart"/>
-      <w:r>
-        <w:rPr>
-          <w:rFonts w:eastAsiaTheme="majorEastAsia"/>
-          <w:color w:val="3A3A3A" w:themeColor="background2" w:themeShade="40"/>
-          <w:spacing w:val="-10"/>
-          <w:kern w:val="28"/>
-          <w:lang w:val="it-IT"/>
-        </w:rPr>
-        <w:t>os</w:t>
-      </w:r>
-      <w:proofErr w:type="spellEnd"/>
-      <w:r>
-        <w:rPr>
-          <w:rFonts w:eastAsiaTheme="majorEastAsia"/>
-          <w:color w:val="3A3A3A" w:themeColor="background2" w:themeShade="40"/>
-          <w:spacing w:val="-10"/>
-          <w:kern w:val="28"/>
-          <w:lang w:val="it-IT"/>
-        </w:rPr>
-        <w:t xml:space="preserve"> </w:t>
-      </w:r>
-      <w:proofErr w:type="spellStart"/>
-      <w:r>
-        <w:rPr>
-          <w:rFonts w:eastAsiaTheme="majorEastAsia"/>
-          <w:color w:val="3A3A3A" w:themeColor="background2" w:themeShade="40"/>
-          <w:spacing w:val="-10"/>
-          <w:kern w:val="28"/>
-          <w:lang w:val="it-IT"/>
-        </w:rPr>
-        <w:t>resultados</w:t>
-      </w:r>
-      <w:proofErr w:type="spellEnd"/>
-      <w:r>
-        <w:rPr>
-          <w:rFonts w:eastAsiaTheme="majorEastAsia"/>
-          <w:color w:val="3A3A3A" w:themeColor="background2" w:themeShade="40"/>
-          <w:spacing w:val="-10"/>
-          <w:kern w:val="28"/>
-          <w:lang w:val="it-IT"/>
-        </w:rPr>
-        <w:t xml:space="preserve"> </w:t>
-      </w:r>
-      <w:proofErr w:type="spellStart"/>
-      <w:r>
-        <w:rPr>
-          <w:rFonts w:eastAsiaTheme="majorEastAsia"/>
-          <w:color w:val="3A3A3A" w:themeColor="background2" w:themeShade="40"/>
-          <w:spacing w:val="-10"/>
-          <w:kern w:val="28"/>
-          <w:lang w:val="it-IT"/>
-        </w:rPr>
-        <w:t>produzidos</w:t>
-      </w:r>
-      <w:proofErr w:type="spellEnd"/>
-      <w:r>
-        <w:rPr>
-          <w:rFonts w:eastAsiaTheme="majorEastAsia"/>
-          <w:color w:val="3A3A3A" w:themeColor="background2" w:themeShade="40"/>
-          <w:spacing w:val="-10"/>
-          <w:kern w:val="28"/>
-          <w:lang w:val="it-IT"/>
-        </w:rPr>
-        <w:t xml:space="preserve"> pelo Python.]</w:t>
-      </w:r>
-    </w:p>
-    <w:p>
-      <w:pPr>
-        <w:rPr>
-          <w:rFonts w:eastAsiaTheme="majorEastAsia"/>
-          <w:color w:val="3A3A3A" w:themeColor="background2" w:themeShade="40"/>
-          <w:spacing w:val="-10"/>
-          <w:kern w:val="28"/>
-        </w:rPr>
-      </w:pPr>
-      <w:r>
-        <w:rPr>
-          <w:rFonts w:eastAsiaTheme="majorEastAsia"/>
-          <w:color w:val="3A3A3A" w:themeColor="background2" w:themeShade="40"/>
-          <w:spacing w:val="-10"/>
-          <w:kern w:val="28"/>
-        </w:rPr>
-        <w:t>Include a table containing suitable descriptive statistics for selected numerical variables, such as:</w:t>
-      </w:r>
-    </w:p>
-    <w:p>
-      <w:pPr>
-        <w:numPr>
-          <w:ilvl w:val="0"/>
-          <w:numId w:val="13"/>
-        </w:numPr>
-        <w:rPr>
-          <w:rFonts w:eastAsiaTheme="majorEastAsia"/>
-          <w:color w:val="3A3A3A" w:themeColor="background2" w:themeShade="40"/>
-          <w:spacing w:val="-10"/>
-          <w:kern w:val="28"/>
-        </w:rPr>
-      </w:pPr>
-      <w:r>
-        <w:rPr>
-          <w:rFonts w:eastAsiaTheme="majorEastAsia"/>
-          <w:color w:val="3A3A3A" w:themeColor="background2" w:themeShade="40"/>
-          <w:spacing w:val="-10"/>
-          <w:kern w:val="28"/>
-        </w:rPr>
-        <w:t>Mean.</w:t>
-      </w:r>
-    </w:p>
-    <w:p>
-      <w:pPr>
-        <w:numPr>
-          <w:ilvl w:val="0"/>
-          <w:numId w:val="13"/>
-        </w:numPr>
-        <w:rPr>
-          <w:rFonts w:eastAsiaTheme="majorEastAsia"/>
-          <w:color w:val="3A3A3A" w:themeColor="background2" w:themeShade="40"/>
-          <w:spacing w:val="-10"/>
-          <w:kern w:val="28"/>
-        </w:rPr>
-      </w:pPr>
-      <w:r>
-        <w:rPr>
-          <w:rFonts w:eastAsiaTheme="majorEastAsia"/>
-          <w:color w:val="3A3A3A" w:themeColor="background2" w:themeShade="40"/>
-          <w:spacing w:val="-10"/>
-          <w:kern w:val="28"/>
-        </w:rPr>
-        <w:t>Median.</w:t>
-      </w:r>
-    </w:p>
-    <w:p>
-      <w:pPr>
-        <w:numPr>
-          <w:ilvl w:val="0"/>
-          <w:numId w:val="13"/>
-        </w:numPr>
-        <w:rPr>
-          <w:rFonts w:eastAsiaTheme="majorEastAsia"/>
-          <w:color w:val="3A3A3A" w:themeColor="background2" w:themeShade="40"/>
-          <w:spacing w:val="-10"/>
-          <w:kern w:val="28"/>
-        </w:rPr>
-      </w:pPr>
-      <w:r>
-        <w:rPr>
-          <w:rFonts w:eastAsiaTheme="majorEastAsia"/>
-          <w:color w:val="3A3A3A" w:themeColor="background2" w:themeShade="40"/>
-          <w:spacing w:val="-10"/>
-          <w:kern w:val="28"/>
-        </w:rPr>
-        <w:lastRenderedPageBreak/>
-        <w:t>Standard deviation.</w:t>
-      </w:r>
-    </w:p>
-    <w:p>
-      <w:pPr>
-        <w:numPr>
-          <w:ilvl w:val="0"/>
-          <w:numId w:val="13"/>
-        </w:numPr>
-        <w:rPr>
-          <w:rFonts w:eastAsiaTheme="majorEastAsia"/>
-          <w:color w:val="3A3A3A" w:themeColor="background2" w:themeShade="40"/>
-          <w:spacing w:val="-10"/>
-          <w:kern w:val="28"/>
-        </w:rPr>
-      </w:pPr>
-      <w:r>
-        <w:rPr>
-          <w:rFonts w:eastAsiaTheme="majorEastAsia"/>
-          <w:color w:val="3A3A3A" w:themeColor="background2" w:themeShade="40"/>
-          <w:spacing w:val="-10"/>
-          <w:kern w:val="28"/>
-        </w:rPr>
-        <w:t>Minimum and maximum.</w:t>
-      </w:r>
-    </w:p>
-    <w:p>
-      <w:pPr>
-        <w:numPr>
-          <w:ilvl w:val="0"/>
-          <w:numId w:val="13"/>
-        </w:numPr>
-        <w:rPr>
-          <w:rFonts w:eastAsiaTheme="majorEastAsia"/>
-          <w:color w:val="3A3A3A" w:themeColor="background2" w:themeShade="40"/>
-          <w:spacing w:val="-10"/>
-          <w:kern w:val="28"/>
-        </w:rPr>
-      </w:pPr>
-      <w:r>
-        <w:rPr>
-          <w:rFonts w:eastAsiaTheme="majorEastAsia"/>
-          <w:color w:val="3A3A3A" w:themeColor="background2" w:themeShade="40"/>
-          <w:spacing w:val="-10"/>
-          <w:kern w:val="28"/>
-        </w:rPr>
-        <w:t>Quartiles.</w:t>
-      </w:r>
-    </w:p>
-    <w:p>
-      <w:pPr>
-        <w:numPr>
-          <w:ilvl w:val="0"/>
-          <w:numId w:val="13"/>
-        </w:numPr>
-        <w:rPr>
-          <w:rFonts w:eastAsiaTheme="majorEastAsia"/>
-          <w:color w:val="3A3A3A" w:themeColor="background2" w:themeShade="40"/>
-          <w:spacing w:val="-10"/>
-          <w:kern w:val="28"/>
-        </w:rPr>
-      </w:pPr>
-      <w:r>
-        <w:rPr>
-          <w:rFonts w:eastAsiaTheme="majorEastAsia"/>
-          <w:color w:val="3A3A3A" w:themeColor="background2" w:themeShade="40"/>
-          <w:spacing w:val="-10"/>
-          <w:kern w:val="28"/>
-        </w:rPr>
-        <w:t>Skewness, where relevant.</w:t>
-      </w:r>
-    </w:p>
-    <w:p>
-      <w:pPr>
-        <w:rPr>
-          <w:rFonts w:eastAsiaTheme="majorEastAsia"/>
-          <w:color w:val="3A3A3A" w:themeColor="background2" w:themeShade="40"/>
-          <w:spacing w:val="-10"/>
-          <w:kern w:val="28"/>
-        </w:rPr>
-      </w:pPr>
-      <w:r>
-        <w:rPr>
-          <w:rFonts w:eastAsiaTheme="majorEastAsia"/>
-          <w:color w:val="3A3A3A" w:themeColor="background2" w:themeShade="40"/>
-          <w:spacing w:val="-10"/>
-          <w:kern w:val="28"/>
-        </w:rPr>
-        <w:t>Discuss the actual results. For example, compare mean and median to identify possible skewness, and explain what the results suggest about customer age, account balance or the number of campaign contacts.</w:t>
-      </w:r>
-    </w:p>
-    <w:p>
-      <w:pPr>
-        <w:rPr>
-          <w:rFonts w:eastAsiaTheme="majorEastAsia"/>
-          <w:color w:val="3A3A3A" w:themeColor="background2" w:themeShade="40"/>
-          <w:spacing w:val="-10"/>
-          <w:kern w:val="28"/>
-        </w:rPr>
-      </w:pPr>
-      <w:r>
-        <w:rPr>
-          <w:rFonts w:eastAsiaTheme="majorEastAsia"/>
-          <w:color w:val="3A3A3A" w:themeColor="background2" w:themeShade="40"/>
-          <w:spacing w:val="-10"/>
-          <w:kern w:val="28"/>
-        </w:rPr>
-        <w:t>For categorical variables, report relevant frequencies or percentages, especially the proportion of clients who subscribed to a term deposit.</w:t>
-      </w:r>
-    </w:p>
-    <w:p>
-      <w:pPr>
-        <w:rPr>
-          <w:rFonts w:eastAsiaTheme="majorEastAsia"/>
-          <w:color w:val="3A3A3A" w:themeColor="background2" w:themeShade="40"/>
-          <w:spacing w:val="-10"/>
-          <w:kern w:val="28"/>
-        </w:rPr>
-      </w:pPr>
-      <w:r>
-        <w:rPr>
-          <w:rFonts w:eastAsiaTheme="majorEastAsia"/>
           <w:b/>
           <w:bCs/>
           <w:color w:val="3A3A3A" w:themeColor="background2" w:themeShade="40"/>
           <w:spacing w:val="-10"/>
           <w:kern w:val="28"/>
-          <w:highlight w:val="yellow"/>
-        </w:rPr>
-        <w:t>Insert Table 1: Descriptive Statistics</w:t>
-      </w:r>
-    </w:p>
-    <w:p>
-      <w:pPr>
-        <w:rPr>
-          <w:rFonts w:eastAsiaTheme="majorEastAsia"/>
-          <w:color w:val="3A3A3A" w:themeColor="background2" w:themeShade="40"/>
-          <w:spacing w:val="-10"/>
-          <w:kern w:val="28"/>
-        </w:rPr>
-      </w:pPr>
-      <w:r>
-        <w:rPr>
-          <w:rFonts w:eastAsiaTheme="majorEastAsia"/>
-          <w:color w:val="3A3A3A" w:themeColor="background2" w:themeShade="40"/>
-          <w:spacing w:val="-10"/>
-          <w:kern w:val="28"/>
-        </w:rPr>
-        <w:t>[</w:t>
-      </w:r>
-      <w:proofErr w:type="spellStart"/>
-      <w:r>
-        <w:rPr>
-          <w:rFonts w:eastAsiaTheme="majorEastAsia"/>
-          <w:color w:val="3A3A3A" w:themeColor="background2" w:themeShade="40"/>
-          <w:spacing w:val="-10"/>
-          <w:kern w:val="28"/>
-        </w:rPr>
-        <w:t>Insira</w:t>
-      </w:r>
-      <w:proofErr w:type="spellEnd"/>
-      <w:r>
-        <w:rPr>
-          <w:rFonts w:eastAsiaTheme="majorEastAsia"/>
-          <w:color w:val="3A3A3A" w:themeColor="background2" w:themeShade="40"/>
-          <w:spacing w:val="-10"/>
-          <w:kern w:val="28"/>
-        </w:rPr>
-        <w:t xml:space="preserve"> </w:t>
-      </w:r>
-      <w:proofErr w:type="spellStart"/>
-      <w:r>
-        <w:rPr>
-          <w:rFonts w:eastAsiaTheme="majorEastAsia"/>
-          <w:color w:val="3A3A3A" w:themeColor="background2" w:themeShade="40"/>
-          <w:spacing w:val="-10"/>
-          <w:kern w:val="28"/>
-        </w:rPr>
-        <w:t>aqui</w:t>
-      </w:r>
-      <w:proofErr w:type="spellEnd"/>
-      <w:r>
-        <w:rPr>
-          <w:rFonts w:eastAsiaTheme="majorEastAsia"/>
-          <w:color w:val="3A3A3A" w:themeColor="background2" w:themeShade="40"/>
-          <w:spacing w:val="-10"/>
-          <w:kern w:val="28"/>
-        </w:rPr>
-        <w:t xml:space="preserve"> a </w:t>
-      </w:r>
-      <w:proofErr w:type="spellStart"/>
-      <w:r>
-        <w:rPr>
-          <w:rFonts w:eastAsiaTheme="majorEastAsia"/>
-          <w:color w:val="3A3A3A" w:themeColor="background2" w:themeShade="40"/>
-          <w:spacing w:val="-10"/>
-          <w:kern w:val="28"/>
-        </w:rPr>
-        <w:t>tabela</w:t>
-      </w:r>
-      <w:proofErr w:type="spellEnd"/>
-      <w:r>
-        <w:rPr>
-          <w:rFonts w:eastAsiaTheme="majorEastAsia"/>
-          <w:color w:val="3A3A3A" w:themeColor="background2" w:themeShade="40"/>
-          <w:spacing w:val="-10"/>
-          <w:kern w:val="28"/>
-        </w:rPr>
-        <w:t xml:space="preserve"> </w:t>
-      </w:r>
-      <w:proofErr w:type="spellStart"/>
-      <w:r>
-        <w:rPr>
-          <w:rFonts w:eastAsiaTheme="majorEastAsia"/>
-          <w:color w:val="3A3A3A" w:themeColor="background2" w:themeShade="40"/>
-          <w:spacing w:val="-10"/>
-          <w:kern w:val="28"/>
-        </w:rPr>
-        <w:t>gerada</w:t>
-      </w:r>
-      <w:proofErr w:type="spellEnd"/>
-      <w:r>
-        <w:rPr>
-          <w:rFonts w:eastAsiaTheme="majorEastAsia"/>
-          <w:color w:val="3A3A3A" w:themeColor="background2" w:themeShade="40"/>
-          <w:spacing w:val="-10"/>
-          <w:kern w:val="28"/>
-        </w:rPr>
-        <w:t xml:space="preserve"> </w:t>
-      </w:r>
-      <w:proofErr w:type="spellStart"/>
-      <w:r>
-        <w:rPr>
-          <w:rFonts w:eastAsiaTheme="majorEastAsia"/>
-          <w:color w:val="3A3A3A" w:themeColor="background2" w:themeShade="40"/>
-          <w:spacing w:val="-10"/>
-          <w:kern w:val="28"/>
-        </w:rPr>
-        <w:t>pelo</w:t>
-      </w:r>
-      <w:proofErr w:type="spellEnd"/>
-      <w:r>
-        <w:rPr>
-          <w:rFonts w:eastAsiaTheme="majorEastAsia"/>
-          <w:color w:val="3A3A3A" w:themeColor="background2" w:themeShade="40"/>
-          <w:spacing w:val="-10"/>
-          <w:kern w:val="28"/>
-        </w:rPr>
-        <w:t xml:space="preserve"> Python.]</w:t>
-      </w:r>
-    </w:p>
-    <w:p>
-      <w:pPr>
+        </w:rPr>
+      </w:pPr>
+      <w:r>
         <w:rPr>
           <w:rFonts w:eastAsiaTheme="majorEastAsia"/>
           <w:b/>
@@ -3570,8 +2936,127 @@
           <w:spacing w:val="-10"/>
           <w:kern w:val="28"/>
         </w:rPr>
-      </w:pPr>
-      <w:r>
+        <w:t>2.3 Descriptive Statistical Analysis</w:t>
+      </w:r>
+    </w:p>
+    <w:p>
+      <w:pPr>
+        <w:ind w:firstLine="720"/>
+        <w:jc w:val="both"/>
+        <w:rPr>
+          <w:rFonts w:eastAsiaTheme="majorEastAsia"/>
+          <w:color w:val="3A3A3A" w:themeColor="background2" w:themeShade="40"/>
+          <w:spacing w:val="-10"/>
+          <w:kern w:val="28"/>
+        </w:rPr>
+      </w:pPr>
+      <w:r>
+        <w:rPr>
+          <w:rFonts w:eastAsiaTheme="majorEastAsia"/>
+          <w:color w:val="3A3A3A" w:themeColor="background2" w:themeShade="40"/>
+          <w:spacing w:val="-10"/>
+          <w:kern w:val="28"/>
+        </w:rPr>
+        <w:t>Descriptive statistics were calculated for five numerical variables: age, balance, duration, campaign and previous. The mean age was 40.94 years, while the median was 39 years, indicating that the average age was slightly higher than the central value. Customer balance had a mean of 1,362.27 and a median of 448, suggesting that the mean may be influenced by customers with relatively high balances. The minimum balance was -8,019 and the maximum was 102,127, demonstrating considerable variation in the data.</w:t>
+      </w:r>
+    </w:p>
+    <w:p>
+      <w:pPr>
+        <w:ind w:firstLine="720"/>
+        <w:jc w:val="both"/>
+        <w:rPr>
+          <w:rFonts w:eastAsiaTheme="majorEastAsia"/>
+          <w:color w:val="3A3A3A" w:themeColor="background2" w:themeShade="40"/>
+          <w:spacing w:val="-10"/>
+          <w:kern w:val="28"/>
+        </w:rPr>
+      </w:pPr>
+      <w:r>
+        <w:rPr>
+          <w:rFonts w:eastAsiaTheme="majorEastAsia"/>
+          <w:color w:val="3A3A3A" w:themeColor="background2" w:themeShade="40"/>
+          <w:spacing w:val="-10"/>
+          <w:kern w:val="28"/>
+        </w:rPr>
+        <w:t xml:space="preserve">Call duration had a mean of 258.16 seconds and a median of 180 seconds. The difference between these values suggests that longer calls may influence the average. The mean number of contacts during the current campaign was 2.76, compared with a median of 2. For previous contacts, the mean was 0.58 and the median was </w:t>
+      </w:r>
+      <w:r>
+        <w:rPr>
+          <w:rFonts w:eastAsiaTheme="majorEastAsia"/>
+          <w:color w:val="3A3A3A" w:themeColor="background2" w:themeShade="40"/>
+          <w:spacing w:val="-10"/>
+          <w:kern w:val="28"/>
+        </w:rPr>
+        <w:lastRenderedPageBreak/>
+        <w:t>zero, indicating that at least half of the observations had no previous contacts recorded. Histograms and additional distribution measures will be used to investigate these patterns further.</w:t>
+      </w:r>
+    </w:p>
+    <w:p>
+      <w:pPr>
+        <w:jc w:val="center"/>
+        <w:rPr>
+          <w:rFonts w:eastAsiaTheme="majorEastAsia"/>
+          <w:color w:val="3A3A3A" w:themeColor="background2" w:themeShade="40"/>
+          <w:spacing w:val="-10"/>
+          <w:kern w:val="28"/>
+        </w:rPr>
+      </w:pPr>
+      <w:r>
+        <w:rPr>
+          <w:rFonts w:eastAsiaTheme="majorEastAsia"/>
+          <w:color w:val="3A3A3A" w:themeColor="background2" w:themeShade="40"/>
+          <w:spacing w:val="-10"/>
+          <w:kern w:val="28"/>
+        </w:rPr>
+        <w:drawing>
+          <wp:inline distT="0" distB="0" distL="0" distR="0" wp14:anchorId="110DAD26" wp14:editId="54B83956">
+            <wp:extent cx="3962429" cy="1447811"/>
+            <wp:effectExtent l="0" t="0" r="0" b="0"/>
+            <wp:docPr id="425993614" name="Picture 1"/>
+            <wp:cNvGraphicFramePr>
+              <a:graphicFrameLocks xmlns:a="http://schemas.openxmlformats.org/drawingml/2006/main" noChangeAspect="1"/>
+            </wp:cNvGraphicFramePr>
+            <a:graphic xmlns:a="http://schemas.openxmlformats.org/drawingml/2006/main">
+              <a:graphicData uri="http://schemas.openxmlformats.org/drawingml/2006/picture">
+                <pic:pic xmlns:pic="http://schemas.openxmlformats.org/drawingml/2006/picture">
+                  <pic:nvPicPr>
+                    <pic:cNvPr id="425993614" name=""/>
+                    <pic:cNvPicPr/>
+                  </pic:nvPicPr>
+                  <pic:blipFill>
+                    <a:blip r:embed="rId14"/>
+                    <a:stretch>
+                      <a:fillRect/>
+                    </a:stretch>
+                  </pic:blipFill>
+                  <pic:spPr>
+                    <a:xfrm>
+                      <a:off x="0" y="0"/>
+                      <a:ext cx="3962429" cy="1447811"/>
+                    </a:xfrm>
+                    <a:prstGeom prst="rect">
+                      <a:avLst/>
+                    </a:prstGeom>
+                  </pic:spPr>
+                </pic:pic>
+              </a:graphicData>
+            </a:graphic>
+          </wp:inline>
+        </w:drawing>
+      </w:r>
+    </w:p>
+    <w:p>
+      <w:pPr>
+        <w:rPr>
+          <w:rFonts w:eastAsiaTheme="majorEastAsia"/>
+          <w:color w:val="3A3A3A" w:themeColor="background2" w:themeShade="40"/>
+          <w:spacing w:val="-10"/>
+          <w:kern w:val="28"/>
+        </w:rPr>
+      </w:pPr>
+    </w:p>
+    <w:p>
+      <w:pPr>
         <w:rPr>
           <w:rFonts w:eastAsiaTheme="majorEastAsia"/>
           <w:b/>
@@ -3579,172 +3064,9 @@
           <w:color w:val="3A3A3A" w:themeColor="background2" w:themeShade="40"/>
           <w:spacing w:val="-10"/>
           <w:kern w:val="28"/>
-          <w:highlight w:val="yellow"/>
-        </w:rPr>
-        <w:t>2.4 Visual Analysis</w:t>
-      </w:r>
-    </w:p>
-    <w:p>
-      <w:pPr>
-        <w:rPr>
-          <w:rFonts w:eastAsiaTheme="majorEastAsia"/>
-          <w:color w:val="3A3A3A" w:themeColor="background2" w:themeShade="40"/>
-          <w:spacing w:val="-10"/>
-          <w:kern w:val="28"/>
-        </w:rPr>
-      </w:pPr>
-      <w:r>
-        <w:rPr>
-          <w:rFonts w:eastAsiaTheme="majorEastAsia"/>
-          <w:color w:val="3A3A3A" w:themeColor="background2" w:themeShade="40"/>
-          <w:spacing w:val="-10"/>
-          <w:kern w:val="28"/>
-        </w:rPr>
-        <w:t>[</w:t>
-      </w:r>
-      <w:proofErr w:type="spellStart"/>
-      <w:r>
-        <w:rPr>
-          <w:rFonts w:eastAsiaTheme="majorEastAsia"/>
-          <w:color w:val="3A3A3A" w:themeColor="background2" w:themeShade="40"/>
-          <w:spacing w:val="-10"/>
-          <w:kern w:val="28"/>
-        </w:rPr>
-        <w:t>Insira</w:t>
-      </w:r>
-      <w:proofErr w:type="spellEnd"/>
-      <w:r>
-        <w:rPr>
-          <w:rFonts w:eastAsiaTheme="majorEastAsia"/>
-          <w:color w:val="3A3A3A" w:themeColor="background2" w:themeShade="40"/>
-          <w:spacing w:val="-10"/>
-          <w:kern w:val="28"/>
-        </w:rPr>
-        <w:t xml:space="preserve"> </w:t>
-      </w:r>
-      <w:proofErr w:type="spellStart"/>
-      <w:r>
-        <w:rPr>
-          <w:rFonts w:eastAsiaTheme="majorEastAsia"/>
-          <w:color w:val="3A3A3A" w:themeColor="background2" w:themeShade="40"/>
-          <w:spacing w:val="-10"/>
-          <w:kern w:val="28"/>
-        </w:rPr>
-        <w:t>pelo</w:t>
-      </w:r>
-      <w:proofErr w:type="spellEnd"/>
-      <w:r>
-        <w:rPr>
-          <w:rFonts w:eastAsiaTheme="majorEastAsia"/>
-          <w:color w:val="3A3A3A" w:themeColor="background2" w:themeShade="40"/>
-          <w:spacing w:val="-10"/>
-          <w:kern w:val="28"/>
-        </w:rPr>
-        <w:t xml:space="preserve"> </w:t>
-      </w:r>
-      <w:proofErr w:type="spellStart"/>
-      <w:r>
-        <w:rPr>
-          <w:rFonts w:eastAsiaTheme="majorEastAsia"/>
-          <w:color w:val="3A3A3A" w:themeColor="background2" w:themeShade="40"/>
-          <w:spacing w:val="-10"/>
-          <w:kern w:val="28"/>
-        </w:rPr>
-        <w:t>menos</w:t>
-      </w:r>
-      <w:proofErr w:type="spellEnd"/>
-      <w:r>
-        <w:rPr>
-          <w:rFonts w:eastAsiaTheme="majorEastAsia"/>
-          <w:color w:val="3A3A3A" w:themeColor="background2" w:themeShade="40"/>
-          <w:spacing w:val="-10"/>
-          <w:kern w:val="28"/>
-        </w:rPr>
-        <w:t xml:space="preserve"> </w:t>
-      </w:r>
-      <w:proofErr w:type="spellStart"/>
-      <w:r>
-        <w:rPr>
-          <w:rFonts w:eastAsiaTheme="majorEastAsia"/>
-          <w:color w:val="3A3A3A" w:themeColor="background2" w:themeShade="40"/>
-          <w:spacing w:val="-10"/>
-          <w:kern w:val="28"/>
-        </w:rPr>
-        <w:t>três</w:t>
-      </w:r>
-      <w:proofErr w:type="spellEnd"/>
-      <w:r>
-        <w:rPr>
-          <w:rFonts w:eastAsiaTheme="majorEastAsia"/>
-          <w:color w:val="3A3A3A" w:themeColor="background2" w:themeShade="40"/>
-          <w:spacing w:val="-10"/>
-          <w:kern w:val="28"/>
-        </w:rPr>
-        <w:t xml:space="preserve"> </w:t>
-      </w:r>
-      <w:proofErr w:type="spellStart"/>
-      <w:r>
-        <w:rPr>
-          <w:rFonts w:eastAsiaTheme="majorEastAsia"/>
-          <w:color w:val="3A3A3A" w:themeColor="background2" w:themeShade="40"/>
-          <w:spacing w:val="-10"/>
-          <w:kern w:val="28"/>
-        </w:rPr>
-        <w:t>gráficos</w:t>
-      </w:r>
-      <w:proofErr w:type="spellEnd"/>
-      <w:r>
-        <w:rPr>
-          <w:rFonts w:eastAsiaTheme="majorEastAsia"/>
-          <w:color w:val="3A3A3A" w:themeColor="background2" w:themeShade="40"/>
-          <w:spacing w:val="-10"/>
-          <w:kern w:val="28"/>
-        </w:rPr>
-        <w:t xml:space="preserve"> e </w:t>
-      </w:r>
-      <w:proofErr w:type="spellStart"/>
-      <w:r>
-        <w:rPr>
-          <w:rFonts w:eastAsiaTheme="majorEastAsia"/>
-          <w:color w:val="3A3A3A" w:themeColor="background2" w:themeShade="40"/>
-          <w:spacing w:val="-10"/>
-          <w:kern w:val="28"/>
-        </w:rPr>
-        <w:t>interprete</w:t>
-      </w:r>
-      <w:proofErr w:type="spellEnd"/>
-      <w:r>
-        <w:rPr>
-          <w:rFonts w:eastAsiaTheme="majorEastAsia"/>
-          <w:color w:val="3A3A3A" w:themeColor="background2" w:themeShade="40"/>
-          <w:spacing w:val="-10"/>
-          <w:kern w:val="28"/>
-        </w:rPr>
-        <w:t xml:space="preserve"> </w:t>
-      </w:r>
-      <w:proofErr w:type="spellStart"/>
-      <w:r>
-        <w:rPr>
-          <w:rFonts w:eastAsiaTheme="majorEastAsia"/>
-          <w:color w:val="3A3A3A" w:themeColor="background2" w:themeShade="40"/>
-          <w:spacing w:val="-10"/>
-          <w:kern w:val="28"/>
-        </w:rPr>
-        <w:t>cada</w:t>
-      </w:r>
-      <w:proofErr w:type="spellEnd"/>
-      <w:r>
-        <w:rPr>
-          <w:rFonts w:eastAsiaTheme="majorEastAsia"/>
-          <w:color w:val="3A3A3A" w:themeColor="background2" w:themeShade="40"/>
-          <w:spacing w:val="-10"/>
-          <w:kern w:val="28"/>
-        </w:rPr>
-        <w:t xml:space="preserve"> um.]</w:t>
-      </w:r>
-    </w:p>
-    <w:p>
-      <w:pPr>
+        </w:rPr>
+      </w:pPr>
+      <w:r>
         <w:rPr>
           <w:rFonts w:eastAsiaTheme="majorEastAsia"/>
           <w:b/>
@@ -3752,9 +3074,13 @@
           <w:color w:val="3A3A3A" w:themeColor="background2" w:themeShade="40"/>
           <w:spacing w:val="-10"/>
           <w:kern w:val="28"/>
-        </w:rPr>
-      </w:pPr>
-      <w:r>
+          <w:highlight w:val="yellow"/>
+        </w:rPr>
+        <w:t>2.4 Visual Analysis</w:t>
+      </w:r>
+    </w:p>
+    <w:p>
+      <w:pPr>
         <w:rPr>
           <w:rFonts w:eastAsiaTheme="majorEastAsia"/>
           <w:b/>
@@ -3762,88 +3088,145 @@
           <w:color w:val="3A3A3A" w:themeColor="background2" w:themeShade="40"/>
           <w:spacing w:val="-10"/>
           <w:kern w:val="28"/>
-          <w:highlight w:val="yellow"/>
-        </w:rPr>
-        <w:t>Figure 1 – Distribution of Customer Age</w:t>
-      </w:r>
-    </w:p>
-    <w:p>
-      <w:pPr>
-        <w:rPr>
-          <w:rFonts w:eastAsiaTheme="majorEastAsia"/>
-          <w:color w:val="3A3A3A" w:themeColor="background2" w:themeShade="40"/>
-          <w:spacing w:val="-10"/>
-          <w:kern w:val="28"/>
-        </w:rPr>
-      </w:pPr>
-      <w:r>
-        <w:rPr>
-          <w:rFonts w:eastAsiaTheme="majorEastAsia"/>
-          <w:color w:val="3A3A3A" w:themeColor="background2" w:themeShade="40"/>
-          <w:spacing w:val="-10"/>
-          <w:kern w:val="28"/>
-        </w:rPr>
-        <w:t>[</w:t>
-      </w:r>
-      <w:proofErr w:type="spellStart"/>
-      <w:r>
-        <w:rPr>
-          <w:rFonts w:eastAsiaTheme="majorEastAsia"/>
-          <w:color w:val="3A3A3A" w:themeColor="background2" w:themeShade="40"/>
-          <w:spacing w:val="-10"/>
-          <w:kern w:val="28"/>
-        </w:rPr>
-        <w:t>Insira</w:t>
-      </w:r>
-      <w:proofErr w:type="spellEnd"/>
-      <w:r>
-        <w:rPr>
-          <w:rFonts w:eastAsiaTheme="majorEastAsia"/>
-          <w:color w:val="3A3A3A" w:themeColor="background2" w:themeShade="40"/>
-          <w:spacing w:val="-10"/>
-          <w:kern w:val="28"/>
-        </w:rPr>
-        <w:t xml:space="preserve"> o </w:t>
-      </w:r>
-      <w:proofErr w:type="spellStart"/>
-      <w:r>
-        <w:rPr>
-          <w:rFonts w:eastAsiaTheme="majorEastAsia"/>
-          <w:color w:val="3A3A3A" w:themeColor="background2" w:themeShade="40"/>
-          <w:spacing w:val="-10"/>
-          <w:kern w:val="28"/>
-        </w:rPr>
-        <w:t>histograma</w:t>
-      </w:r>
-      <w:proofErr w:type="spellEnd"/>
-      <w:r>
-        <w:rPr>
-          <w:rFonts w:eastAsiaTheme="majorEastAsia"/>
-          <w:color w:val="3A3A3A" w:themeColor="background2" w:themeShade="40"/>
-          <w:spacing w:val="-10"/>
-          <w:kern w:val="28"/>
-        </w:rPr>
-        <w:t xml:space="preserve"> de age.]</w:t>
-      </w:r>
-    </w:p>
-    <w:p>
-      <w:pPr>
-        <w:rPr>
-          <w:rFonts w:eastAsiaTheme="majorEastAsia"/>
-          <w:color w:val="3A3A3A" w:themeColor="background2" w:themeShade="40"/>
-          <w:spacing w:val="-10"/>
-          <w:kern w:val="28"/>
-        </w:rPr>
-      </w:pPr>
-      <w:r>
-        <w:rPr>
-          <w:rFonts w:eastAsiaTheme="majorEastAsia"/>
-          <w:color w:val="3A3A3A" w:themeColor="background2" w:themeShade="40"/>
-          <w:spacing w:val="-10"/>
-          <w:kern w:val="28"/>
-        </w:rPr>
-        <w:t>Interpret the shape of the distribution, the concentration of observations and any apparent skewness.</w:t>
-      </w:r>
+        </w:rPr>
+      </w:pPr>
+    </w:p>
+    <w:p>
+      <w:pPr>
+        <w:ind w:firstLine="720"/>
+        <w:jc w:val="both"/>
+        <w:rPr>
+          <w:rFonts w:eastAsiaTheme="majorEastAsia"/>
+          <w:color w:val="3A3A3A" w:themeColor="background2" w:themeShade="40"/>
+          <w:spacing w:val="-10"/>
+          <w:kern w:val="28"/>
+        </w:rPr>
+      </w:pPr>
+      <w:r>
+        <w:rPr>
+          <w:rFonts w:eastAsiaTheme="majorEastAsia"/>
+          <w:color w:val="3A3A3A" w:themeColor="background2" w:themeShade="40"/>
+          <w:spacing w:val="-10"/>
+          <w:kern w:val="28"/>
+        </w:rPr>
+        <w:t>The age variable ranges from 18 to 95 years, with a mean of 40.94 years and a median of 39 years. The highest frequencies occur among customers in their early thirties, with 2,085 customers aged 32 and 1,996 aged 31. The mean being higher than the median, together with a skewness value of 0.685, suggests a moderately right-skewed distribution. This indicates that the distribution is not perfectly symmetrical, although further graphical analysis is required before assessing whether a normal distribution provides a reasonable approximation.</w:t>
+      </w:r>
+    </w:p>
+    <w:p>
+      <w:pPr>
+        <w:jc w:val="center"/>
+        <w:rPr>
+          <w:rFonts w:eastAsiaTheme="majorEastAsia"/>
+          <w:color w:val="3A3A3A" w:themeColor="background2" w:themeShade="40"/>
+          <w:spacing w:val="-10"/>
+          <w:kern w:val="28"/>
+        </w:rPr>
+      </w:pPr>
+      <w:r>
+        <w:rPr>
+          <w:rFonts w:eastAsiaTheme="majorEastAsia"/>
+          <w:color w:val="3A3A3A" w:themeColor="background2" w:themeShade="40"/>
+          <w:spacing w:val="-10"/>
+          <w:kern w:val="28"/>
+        </w:rPr>
+        <w:drawing>
+          <wp:inline distT="0" distB="0" distL="0" distR="0" wp14:anchorId="6487A544" wp14:editId="5B3FBC32">
+            <wp:extent cx="3821430" cy="2329438"/>
+            <wp:effectExtent l="0" t="0" r="7620" b="0"/>
+            <wp:docPr id="193950335" name="Picture 1"/>
+            <wp:cNvGraphicFramePr>
+              <a:graphicFrameLocks xmlns:a="http://schemas.openxmlformats.org/drawingml/2006/main" noChangeAspect="1"/>
+            </wp:cNvGraphicFramePr>
+            <a:graphic xmlns:a="http://schemas.openxmlformats.org/drawingml/2006/main">
+              <a:graphicData uri="http://schemas.openxmlformats.org/drawingml/2006/picture">
+                <pic:pic xmlns:pic="http://schemas.openxmlformats.org/drawingml/2006/picture">
+                  <pic:nvPicPr>
+                    <pic:cNvPr id="193950335" name=""/>
+                    <pic:cNvPicPr/>
+                  </pic:nvPicPr>
+                  <pic:blipFill>
+                    <a:blip r:embed="rId15"/>
+                    <a:stretch>
+                      <a:fillRect/>
+                    </a:stretch>
+                  </pic:blipFill>
+                  <pic:spPr>
+                    <a:xfrm>
+                      <a:off x="0" y="0"/>
+                      <a:ext cx="3849824" cy="2346746"/>
+                    </a:xfrm>
+                    <a:prstGeom prst="rect">
+                      <a:avLst/>
+                    </a:prstGeom>
+                  </pic:spPr>
+                </pic:pic>
+              </a:graphicData>
+            </a:graphic>
+          </wp:inline>
+        </w:drawing>
+      </w:r>
+    </w:p>
+    <w:p>
+      <w:pPr>
+        <w:jc w:val="right"/>
+        <w:rPr>
+          <w:rFonts w:eastAsiaTheme="majorEastAsia"/>
+          <w:color w:val="3A3A3A" w:themeColor="background2" w:themeShade="40"/>
+          <w:spacing w:val="-10"/>
+          <w:kern w:val="28"/>
+        </w:rPr>
+      </w:pPr>
+      <w:r>
+        <w:rPr>
+          <w:rFonts w:eastAsiaTheme="majorEastAsia"/>
+          <w:color w:val="3A3A3A" w:themeColor="background2" w:themeShade="40"/>
+          <w:spacing w:val="-10"/>
+          <w:kern w:val="28"/>
+        </w:rPr>
+        <w:t>Figure 1. Distribution of Customer Age.</w:t>
+      </w:r>
+    </w:p>
+    <w:p>
+      <w:pPr>
+        <w:jc w:val="both"/>
+        <w:rPr>
+          <w:rFonts w:eastAsiaTheme="majorEastAsia"/>
+          <w:color w:val="3A3A3A" w:themeColor="background2" w:themeShade="40"/>
+          <w:spacing w:val="-10"/>
+          <w:kern w:val="28"/>
+        </w:rPr>
+      </w:pPr>
+    </w:p>
+    <w:p>
+      <w:pPr>
+        <w:jc w:val="center"/>
+        <w:rPr>
+          <w:rFonts w:eastAsiaTheme="majorEastAsia"/>
+          <w:color w:val="3A3A3A" w:themeColor="background2" w:themeShade="40"/>
+          <w:spacing w:val="-10"/>
+          <w:kern w:val="28"/>
+        </w:rPr>
+      </w:pPr>
+    </w:p>
+    <w:p>
+      <w:pPr>
+        <w:rPr>
+          <w:rFonts w:eastAsiaTheme="majorEastAsia"/>
+          <w:color w:val="3A3A3A" w:themeColor="background2" w:themeShade="40"/>
+          <w:spacing w:val="-10"/>
+          <w:kern w:val="28"/>
+        </w:rPr>
+      </w:pPr>
+    </w:p>
+    <w:p>
+      <w:pPr>
+        <w:rPr>
+          <w:rFonts w:eastAsiaTheme="majorEastAsia"/>
+          <w:color w:val="3A3A3A" w:themeColor="background2" w:themeShade="40"/>
+          <w:spacing w:val="-10"/>
+          <w:kern w:val="28"/>
+        </w:rPr>
+      </w:pPr>
     </w:p>
     <w:p>
       <w:pPr>
@@ -3866,6 +3249,108 @@
           <w:kern w:val="28"/>
           <w:highlight w:val="yellow"/>
         </w:rPr>
+        <w:t>Figure 1 – Distribution of Customer Age</w:t>
+      </w:r>
+    </w:p>
+    <w:p>
+      <w:pPr>
+        <w:rPr>
+          <w:rFonts w:eastAsiaTheme="majorEastAsia"/>
+          <w:color w:val="3A3A3A" w:themeColor="background2" w:themeShade="40"/>
+          <w:spacing w:val="-10"/>
+          <w:kern w:val="28"/>
+        </w:rPr>
+      </w:pPr>
+      <w:r>
+        <w:rPr>
+          <w:rFonts w:eastAsiaTheme="majorEastAsia"/>
+          <w:color w:val="3A3A3A" w:themeColor="background2" w:themeShade="40"/>
+          <w:spacing w:val="-10"/>
+          <w:kern w:val="28"/>
+        </w:rPr>
+        <w:t>[</w:t>
+      </w:r>
+      <w:proofErr w:type="spellStart"/>
+      <w:r>
+        <w:rPr>
+          <w:rFonts w:eastAsiaTheme="majorEastAsia"/>
+          <w:color w:val="3A3A3A" w:themeColor="background2" w:themeShade="40"/>
+          <w:spacing w:val="-10"/>
+          <w:kern w:val="28"/>
+        </w:rPr>
+        <w:t>Insira</w:t>
+      </w:r>
+      <w:proofErr w:type="spellEnd"/>
+      <w:r>
+        <w:rPr>
+          <w:rFonts w:eastAsiaTheme="majorEastAsia"/>
+          <w:color w:val="3A3A3A" w:themeColor="background2" w:themeShade="40"/>
+          <w:spacing w:val="-10"/>
+          <w:kern w:val="28"/>
+        </w:rPr>
+        <w:t xml:space="preserve"> o </w:t>
+      </w:r>
+      <w:proofErr w:type="spellStart"/>
+      <w:r>
+        <w:rPr>
+          <w:rFonts w:eastAsiaTheme="majorEastAsia"/>
+          <w:color w:val="3A3A3A" w:themeColor="background2" w:themeShade="40"/>
+          <w:spacing w:val="-10"/>
+          <w:kern w:val="28"/>
+        </w:rPr>
+        <w:t>histograma</w:t>
+      </w:r>
+      <w:proofErr w:type="spellEnd"/>
+      <w:r>
+        <w:rPr>
+          <w:rFonts w:eastAsiaTheme="majorEastAsia"/>
+          <w:color w:val="3A3A3A" w:themeColor="background2" w:themeShade="40"/>
+          <w:spacing w:val="-10"/>
+          <w:kern w:val="28"/>
+        </w:rPr>
+        <w:t xml:space="preserve"> de age.]</w:t>
+      </w:r>
+    </w:p>
+    <w:p>
+      <w:pPr>
+        <w:rPr>
+          <w:rFonts w:eastAsiaTheme="majorEastAsia"/>
+          <w:color w:val="3A3A3A" w:themeColor="background2" w:themeShade="40"/>
+          <w:spacing w:val="-10"/>
+          <w:kern w:val="28"/>
+        </w:rPr>
+      </w:pPr>
+      <w:r>
+        <w:rPr>
+          <w:rFonts w:eastAsiaTheme="majorEastAsia"/>
+          <w:color w:val="3A3A3A" w:themeColor="background2" w:themeShade="40"/>
+          <w:spacing w:val="-10"/>
+          <w:kern w:val="28"/>
+        </w:rPr>
+        <w:t>Interpret the shape of the distribution, the concentration of observations and any apparent skewness.</w:t>
+      </w:r>
+    </w:p>
+    <w:p>
+      <w:pPr>
+        <w:rPr>
+          <w:rFonts w:eastAsiaTheme="majorEastAsia"/>
+          <w:b/>
+          <w:bCs/>
+          <w:color w:val="3A3A3A" w:themeColor="background2" w:themeShade="40"/>
+          <w:spacing w:val="-10"/>
+          <w:kern w:val="28"/>
+        </w:rPr>
+      </w:pPr>
+      <w:r>
+        <w:rPr>
+          <w:rFonts w:eastAsiaTheme="majorEastAsia"/>
+          <w:b/>
+          <w:bCs/>
+          <w:color w:val="3A3A3A" w:themeColor="background2" w:themeShade="40"/>
+          <w:spacing w:val="-10"/>
+          <w:kern w:val="28"/>
+          <w:highlight w:val="yellow"/>
+        </w:rPr>
         <w:t>Figure 2 – Campaign Success Rate by Job</w:t>
       </w:r>
     </w:p>
@@ -3887,6 +3372,7 @@
           <w:kern w:val="28"/>
           <w:lang w:val="it-IT"/>
         </w:rPr>
+        <w:lastRenderedPageBreak/>
         <w:t>[</w:t>
       </w:r>
       <w:proofErr w:type="spellStart"/>
@@ -4665,7 +4151,6 @@
           <w:spacing w:val="-10"/>
           <w:kern w:val="28"/>
         </w:rPr>
-        <w:lastRenderedPageBreak/>
         <w:t>The number of successes, (k).</w:t>
       </w:r>
     </w:p>
@@ -5480,6 +4965,7 @@
           <w:spacing w:val="-10"/>
           <w:kern w:val="28"/>
         </w:rPr>
+        <w:lastRenderedPageBreak/>
         <w:t>The Poisson probability formula:</w:t>
       </w:r>
     </w:p>
@@ -6312,7 +5798,6 @@
           <w:spacing w:val="-10"/>
           <w:kern w:val="28"/>
         </w:rPr>
-        <w:lastRenderedPageBreak/>
         <w:t>Explain:</w:t>
       </w:r>
     </w:p>
@@ -6747,6 +6232,7 @@
           <w:spacing w:val="-10"/>
           <w:kern w:val="28"/>
         </w:rPr>
+        <w:lastRenderedPageBreak/>
         <w:t xml:space="preserve">[Resuma as </w:t>
       </w:r>
       <w:proofErr w:type="spellStart"/>
@@ -7361,7 +6847,7 @@
         </w:rPr>
         <w:t xml:space="preserve">. Available at: </w:t>
       </w:r>
-      <w:hyperlink r:id="rId14" w:history="1">
+      <w:hyperlink r:id="rId16" w:history="1">
         <w:r>
           <w:rPr>
             <w:rStyle w:val="Hyperlink"/>
@@ -7399,7 +6885,6 @@
           <w:kern w:val="28"/>
           <w:lang w:val="fr-FR"/>
         </w:rPr>
-        <w:lastRenderedPageBreak/>
         <w:t>[</w:t>
       </w:r>
       <w:proofErr w:type="spellStart"/>
@@ -8399,6 +7884,7 @@
           <w:spacing w:val="-10"/>
           <w:kern w:val="28"/>
         </w:rPr>
+        <w:lastRenderedPageBreak/>
         <w:t>Which Python operations or statistical concepts were most challenging.</w:t>
       </w:r>
     </w:p>
@@ -8490,12 +7976,11 @@
       <w:pPr>
         <w:pStyle w:val="Heading1"/>
       </w:pPr>
-      <w:bookmarkStart w:id="14" w:name="_heading=h.2et92p0" w:colFirst="0" w:colLast="0"/>
-      <w:bookmarkEnd w:id="14"/>
-      <w:r>
-        <w:lastRenderedPageBreak/>
+      <w:bookmarkStart w:id="13" w:name="_Toc244029381"/>
+      <w:r>
         <w:t>References</w:t>
       </w:r>
+      <w:bookmarkEnd w:id="13"/>
     </w:p>
     <w:p/>
     <w:p>
@@ -8557,11 +8042,13 @@
       <w:pPr>
         <w:pStyle w:val="Heading1"/>
       </w:pPr>
-      <w:bookmarkStart w:id="15" w:name="_heading=h.kfkjs3rwl2c1" w:colFirst="0" w:colLast="0"/>
+      <w:bookmarkStart w:id="14" w:name="_heading=h.kfkjs3rwl2c1" w:colFirst="0" w:colLast="0"/>
+      <w:bookmarkStart w:id="15" w:name="_Toc244029382"/>
+      <w:bookmarkEnd w:id="14"/>
+      <w:r>
+        <w:t>Appendix</w:t>
+      </w:r>
       <w:bookmarkEnd w:id="15"/>
-      <w:r>
-        <w:t>Appendix</w:t>
-      </w:r>
     </w:p>
     <w:p/>
     <w:p>
@@ -8569,6 +8056,7 @@
         <w:rPr>
           <w:noProof/>
         </w:rPr>
+        <w:lastRenderedPageBreak/>
         <w:drawing>
           <wp:inline distT="0" distB="0" distL="0" distR="0" wp14:anchorId="2408230F" wp14:editId="22DEB6EE">
             <wp:extent cx="5731510" cy="3722370"/>
@@ -8585,7 +8073,7 @@
                     <pic:cNvPicPr/>
                   </pic:nvPicPr>
                   <pic:blipFill>
-                    <a:blip r:embed="rId15"/>
+                    <a:blip r:embed="rId17"/>
                     <a:stretch>
                       <a:fillRect/>
                     </a:stretch>
@@ -8662,7 +8150,7 @@
     </w:p>
     <w:p/>
     <w:sectPr>
-      <w:footerReference w:type="default" r:id="rId16"/>
+      <w:footerReference w:type="default" r:id="rId18"/>
       <w:pgSz w:w="11906" w:h="16838"/>
       <w:pgMar w:top="1440" w:right="1440" w:bottom="1440" w:left="1440" w:header="708" w:footer="708" w:gutter="0"/>
       <w:pgNumType w:start="1"/>
@@ -13027,20 +12515,6 @@
 </file>
 
 <file path=customXml/item1.xml><?xml version="1.0" encoding="utf-8"?>
-<p:properties xmlns:p="http://schemas.microsoft.com/office/2006/metadata/properties" xmlns:xsi="http://www.w3.org/2001/XMLSchema-instance" xmlns:pc="http://schemas.microsoft.com/office/infopath/2007/PartnerControls">
-  <documentManagement>
-    <_activity xmlns="b16a9495-4dfd-42d3-807b-98cb11f03b43" xsi:nil="true"/>
-  </documentManagement>
-</p:properties>
-</file>
-
-<file path=customXml/item2.xml><?xml version="1.0" encoding="utf-8"?>
-<go:gDocsCustomXmlDataStorage xmlns:go="http://customooxmlschemas.google.com/" xmlns:r="http://schemas.openxmlformats.org/officeDocument/2006/relationships" uri="GoogleDocsCustomDataVersion2">
-  <go:docsCustomData xmlns:go="http://customooxmlschemas.google.com/" roundtripDataSignature="AMtx7miehlgh2pzFvkmpnhkVaeODs3Wnuw==">CgMxLjAyCGguZ2pkZ3hzMgloLjMwajB6bGwyCWguMWZvYjl0ZTIJaC4zem55c2g3MgloLjJldDkycDAyDmgua2ZranMzcndsMmMxOAByITF6bEVRVXYyWkdtTjZWemdfYk5uaGpmb0x1c2hhYUo3dw==</go:docsCustomData>
-</go:gDocsCustomXmlDataStorage>
-</file>
-
-<file path=customXml/item3.xml><?xml version="1.0" encoding="utf-8"?>
 <ct:contentTypeSchema xmlns:ct="http://schemas.microsoft.com/office/2006/metadata/contentType" xmlns:ma="http://schemas.microsoft.com/office/2006/metadata/properties/metaAttributes" ct:_="" ma:_="" ma:contentTypeName="Document" ma:contentTypeID="0x01010091CA7052A48FB44E8BAE44044031FC77" ma:contentTypeVersion="5" ma:contentTypeDescription="Create a new document." ma:contentTypeScope="" ma:versionID="72110da391d7bf7bbbd9879cda66318c">
   <xsd:schema xmlns:xsd="http://www.w3.org/2001/XMLSchema" xmlns:xs="http://www.w3.org/2001/XMLSchema" xmlns:p="http://schemas.microsoft.com/office/2006/metadata/properties" xmlns:ns3="b16a9495-4dfd-42d3-807b-98cb11f03b43" targetNamespace="http://schemas.microsoft.com/office/2006/metadata/properties" ma:root="true" ma:fieldsID="65d4c4ab10123b5e2192ffab3149626d" ns3:_="">
     <xsd:import namespace="b16a9495-4dfd-42d3-807b-98cb11f03b43"/>
@@ -13190,11 +12664,21 @@
 </ct:contentTypeSchema>
 </file>
 
-<file path=customXml/item4.xml><?xml version="1.0" encoding="utf-8"?>
-<b:Sources xmlns:b="http://schemas.openxmlformats.org/officeDocument/2006/bibliography" xmlns="http://schemas.openxmlformats.org/officeDocument/2006/bibliography" SelectedStyle="\APASixthEditionOfficeOnline.xsl" StyleName="APA" Version="6"/>
+<file path=customXml/item2.xml><?xml version="1.0" encoding="utf-8"?>
+<go:gDocsCustomXmlDataStorage xmlns:go="http://customooxmlschemas.google.com/" xmlns:r="http://schemas.openxmlformats.org/officeDocument/2006/relationships" uri="GoogleDocsCustomDataVersion2">
+  <go:docsCustomData xmlns:go="http://customooxmlschemas.google.com/" roundtripDataSignature="AMtx7miehlgh2pzFvkmpnhkVaeODs3Wnuw==">CgMxLjAyCGguZ2pkZ3hzMgloLjMwajB6bGwyCWguMWZvYjl0ZTIJaC4zem55c2g3MgloLjJldDkycDAyDmgua2ZranMzcndsMmMxOAByITF6bEVRVXYyWkdtTjZWemdfYk5uaGpmb0x1c2hhYUo3dw==</go:docsCustomData>
+</go:gDocsCustomXmlDataStorage>
 </file>
 
-<file path=customXml/item5.xml><?xml version="1.0" encoding="utf-8"?>
+<file path=customXml/item3.xml><?xml version="1.0" encoding="utf-8"?>
+<p:properties xmlns:p="http://schemas.microsoft.com/office/2006/metadata/properties" xmlns:xsi="http://www.w3.org/2001/XMLSchema-instance" xmlns:pc="http://schemas.microsoft.com/office/infopath/2007/PartnerControls">
+  <documentManagement>
+    <_activity xmlns="b16a9495-4dfd-42d3-807b-98cb11f03b43" xsi:nil="true"/>
+  </documentManagement>
+</p:properties>
+</file>
+
+<file path=customXml/item4.xml><?xml version="1.0" encoding="utf-8"?>
 <?mso-contentType ?>
 <FormTemplates xmlns="http://schemas.microsoft.com/sharepoint/v3/contenttype/forms">
   <Display>DocumentLibraryForm</Display>
@@ -13203,26 +12687,11 @@
 </FormTemplates>
 </file>
 
-<file path=customXml/itemProps1.xml><?xml version="1.0" encoding="utf-8"?>
-<ds:datastoreItem xmlns:ds="http://schemas.openxmlformats.org/officeDocument/2006/customXml" ds:itemID="{D51EB97A-8C7A-4EE1-A3AD-E57FDBFA6BEE}">
-  <ds:schemaRefs>
-    <ds:schemaRef ds:uri="http://schemas.microsoft.com/office/2006/metadata/properties"/>
-    <ds:schemaRef ds:uri="http://schemas.microsoft.com/office/infopath/2007/PartnerControls"/>
-    <ds:schemaRef ds:uri="b16a9495-4dfd-42d3-807b-98cb11f03b43"/>
-  </ds:schemaRefs>
-</ds:datastoreItem>
+<file path=customXml/item5.xml><?xml version="1.0" encoding="utf-8"?>
+<b:Sources xmlns:b="http://schemas.openxmlformats.org/officeDocument/2006/bibliography" xmlns="http://schemas.openxmlformats.org/officeDocument/2006/bibliography" SelectedStyle="\APASixthEditionOfficeOnline.xsl" StyleName="APA" Version="6"/>
 </file>
 
-<file path=customXml/itemProps2.xml><?xml version="1.0" encoding="utf-8"?>
-<ds:datastoreItem xmlns:ds="http://schemas.openxmlformats.org/officeDocument/2006/customXml" ds:itemID="{11111111-1234-1234-1234-123412341234}">
-  <ds:schemaRefs>
-    <ds:schemaRef ds:uri="http://customooxmlschemas.google.com/"/>
-    <ds:schemaRef ds:uri="http://schemas.openxmlformats.org/officeDocument/2006/relationships"/>
-  </ds:schemaRefs>
-</ds:datastoreItem>
-</file>
-
-<file path=customXml/itemProps3.xml><?xml version="1.0" encoding="utf-8"?>
+<file path=customXml/itemProps1.xml><?xml version="1.0" encoding="utf-8"?>
 <ds:datastoreItem xmlns:ds="http://schemas.openxmlformats.org/officeDocument/2006/customXml" ds:itemID="{1CD39011-2B34-4226-8638-59B13D86301D}">
   <ds:schemaRefs>
     <ds:schemaRef ds:uri="http://schemas.microsoft.com/office/2006/metadata/contentType"/>
@@ -13240,18 +12709,37 @@
 </ds:datastoreItem>
 </file>
 
+<file path=customXml/itemProps2.xml><?xml version="1.0" encoding="utf-8"?>
+<ds:datastoreItem xmlns:ds="http://schemas.openxmlformats.org/officeDocument/2006/customXml" ds:itemID="{11111111-1234-1234-1234-123412341234}">
+  <ds:schemaRefs>
+    <ds:schemaRef ds:uri="http://customooxmlschemas.google.com/"/>
+    <ds:schemaRef ds:uri="http://schemas.openxmlformats.org/officeDocument/2006/relationships"/>
+  </ds:schemaRefs>
+</ds:datastoreItem>
+</file>
+
+<file path=customXml/itemProps3.xml><?xml version="1.0" encoding="utf-8"?>
+<ds:datastoreItem xmlns:ds="http://schemas.openxmlformats.org/officeDocument/2006/customXml" ds:itemID="{D51EB97A-8C7A-4EE1-A3AD-E57FDBFA6BEE}">
+  <ds:schemaRefs>
+    <ds:schemaRef ds:uri="http://schemas.microsoft.com/office/2006/metadata/properties"/>
+    <ds:schemaRef ds:uri="http://schemas.microsoft.com/office/infopath/2007/PartnerControls"/>
+    <ds:schemaRef ds:uri="b16a9495-4dfd-42d3-807b-98cb11f03b43"/>
+  </ds:schemaRefs>
+</ds:datastoreItem>
+</file>
+
 <file path=customXml/itemProps4.xml><?xml version="1.0" encoding="utf-8"?>
+<ds:datastoreItem xmlns:ds="http://schemas.openxmlformats.org/officeDocument/2006/customXml" ds:itemID="{AD64260C-1345-4C21-A804-B9FBE7B91489}">
+  <ds:schemaRefs>
+    <ds:schemaRef ds:uri="http://schemas.microsoft.com/sharepoint/v3/contenttype/forms"/>
+  </ds:schemaRefs>
+</ds:datastoreItem>
+</file>
+
+<file path=customXml/itemProps5.xml><?xml version="1.0" encoding="utf-8"?>
 <ds:datastoreItem xmlns:ds="http://schemas.openxmlformats.org/officeDocument/2006/customXml" ds:itemID="{A5C61161-19E4-4D42-A5DA-EC591AFE0A7D}">
   <ds:schemaRefs>
     <ds:schemaRef ds:uri="http://schemas.openxmlformats.org/officeDocument/2006/bibliography"/>
   </ds:schemaRefs>
 </ds:datastoreItem>
-</file>
-
-<file path=customXml/itemProps5.xml><?xml version="1.0" encoding="utf-8"?>
-<ds:datastoreItem xmlns:ds="http://schemas.openxmlformats.org/officeDocument/2006/customXml" ds:itemID="{AD64260C-1345-4C21-A804-B9FBE7B91489}">
-  <ds:schemaRefs>
-    <ds:schemaRef ds:uri="http://schemas.microsoft.com/sharepoint/v3/contenttype/forms"/>
-  </ds:schemaRefs>
-</ds:datastoreItem>
 </file>
</xml_diff>